<commit_message>
Guion 1 DOMUS: exclusividad, alta demanda, entrega inmediata y último de la colección
Co-Authored-By: Claude Opus 5.5 <noreply@anthropic.com>
Claude-Session: https://claude.ai/code/session_01GNAWuRBmVuoQKTgJ9U3tZK
</commit_message>
<xml_diff>
--- a/propiedades/domus-san-patricio-5a/Guiones DOMUS San Patricio.docx
+++ b/propiedades/domus-san-patricio-5a/Guiones DOMUS San Patricio.docx
@@ -285,7 +285,7 @@
                 <w:sz w:val="19"/>
                 <w:szCs w:val="19"/>
               </w:rPr>
-              <w:t xml:space="preserve">$1.520 millones (última unidad disponible)</w:t>
+              <w:t xml:space="preserve">$1.520 millones · última unidad de la colección · entrega inmediata</w:t>
             </w:r>
           </w:p>
         </w:tc>
@@ -857,7 +857,7 @@
           <w:sz w:val="16"/>
           <w:szCs w:val="16"/>
         </w:rPr>
-        <w:t xml:space="preserve">GUION 1 · ~55 S · 139 PALABRAS</w:t>
+        <w:t xml:space="preserve">GUION 1 · ~60 S · 157 PALABRAS</w:t>
       </w:r>
     </w:p>
     <w:p>
@@ -894,7 +894,7 @@
           <w:sz w:val="21"/>
           <w:szCs w:val="21"/>
         </w:rPr>
-        <w:t xml:space="preserve">El precio va en la primera frase: quien no está en ese rango se va en 3 segundos, y quien se queda ya es comprador.</w:t>
+        <w:t xml:space="preserve">El precio va en la primera frase para segmentar, y todo el guion transmite exclusividad, alta demanda y privilegio: último de la colección, entrega inmediata, las demás unidades ya tienen dueño y visita privada.</w:t>
       </w:r>
     </w:p>
     <w:tbl>
@@ -1054,7 +1054,7 @@
                 <w:sz w:val="17"/>
                 <w:szCs w:val="17"/>
               </w:rPr>
-              <w:t xml:space="preserve">0–4 s</w:t>
+              <w:t xml:space="preserve">0–5 s</w:t>
             </w:r>
           </w:p>
         </w:tc>
@@ -1085,7 +1085,7 @@
                 <w:sz w:val="21"/>
                 <w:szCs w:val="21"/>
               </w:rPr>
-              <w:t xml:space="preserve">Por 1.520 millones, este es el apartamento que te puedes llevar en San Patricio, el sector donde todos quieren vivir en Bogotá.</w:t>
+              <w:t xml:space="preserve">Por 1.520 millones, este es el último apartamento de la colección DOMUS San Patricio, en el sector donde viven las personas más exclusivas de Bogotá.</w:t>
             </w:r>
           </w:p>
         </w:tc>
@@ -1127,7 +1127,7 @@
                 <w:sz w:val="18"/>
                 <w:szCs w:val="18"/>
               </w:rPr>
-              <w:t xml:space="preserve">$1.520M · San Patricio</w:t>
+              <w:t xml:space="preserve">$1.520M · Último de la colección DOMUS</w:t>
             </w:r>
           </w:p>
         </w:tc>
@@ -1165,7 +1165,7 @@
                 <w:sz w:val="17"/>
                 <w:szCs w:val="17"/>
               </w:rPr>
-              <w:t xml:space="preserve">4–8 s</w:t>
+              <w:t xml:space="preserve">5–10 s</w:t>
             </w:r>
           </w:p>
         </w:tc>
@@ -1196,7 +1196,7 @@
                 <w:sz w:val="21"/>
                 <w:szCs w:val="21"/>
               </w:rPr>
-              <w:t xml:space="preserve">116 metros cuadrados, más de 500 de zonas comunes, y es la última unidad disponible. Acompáñame.</w:t>
+              <w:t xml:space="preserve">116 metros cuadrados, más de 500 de zonas comunes y entrega inmediata. Las demás unidades ya tienen dueño. Acompáñame.</w:t>
             </w:r>
           </w:p>
         </w:tc>
@@ -1238,7 +1238,7 @@
                 <w:sz w:val="18"/>
                 <w:szCs w:val="18"/>
               </w:rPr>
-              <w:t xml:space="preserve">116 m² + 500 m² · Última unidad</w:t>
+              <w:t xml:space="preserve">116 m² + 500 m² · Entrega inmediata</w:t>
             </w:r>
           </w:p>
         </w:tc>
@@ -1276,7 +1276,7 @@
                 <w:sz w:val="17"/>
                 <w:szCs w:val="17"/>
               </w:rPr>
-              <w:t xml:space="preserve">8–15 s</w:t>
+              <w:t xml:space="preserve">10–17 s</w:t>
             </w:r>
           </w:p>
         </w:tc>
@@ -1376,7 +1376,7 @@
                 <w:sz w:val="17"/>
                 <w:szCs w:val="17"/>
               </w:rPr>
-              <w:t xml:space="preserve">15–21 s</w:t>
+              <w:t xml:space="preserve">17–23 s</w:t>
             </w:r>
           </w:p>
         </w:tc>
@@ -1476,7 +1476,7 @@
                 <w:sz w:val="17"/>
                 <w:szCs w:val="17"/>
               </w:rPr>
-              <w:t xml:space="preserve">21–30 s</w:t>
+              <w:t xml:space="preserve">23–32 s</w:t>
             </w:r>
           </w:p>
         </w:tc>
@@ -1507,7 +1507,7 @@
                 <w:sz w:val="21"/>
                 <w:szCs w:val="21"/>
               </w:rPr>
-              <w:t xml:space="preserve">En la principal entras por un walking closet amplio hasta tu baño privado. Y tiene su propio balcón. El otro baño es social.</w:t>
+              <w:t xml:space="preserve">En la principal entras por un walking closet amplio hasta tu baño privado, y tienes tu propio balcón. El otro baño es social.</w:t>
             </w:r>
           </w:p>
         </w:tc>
@@ -1576,7 +1576,7 @@
                 <w:sz w:val="17"/>
                 <w:szCs w:val="17"/>
               </w:rPr>
-              <w:t xml:space="preserve">30–34 s</w:t>
+              <w:t xml:space="preserve">32–36 s</w:t>
             </w:r>
           </w:p>
         </w:tc>
@@ -1687,7 +1687,7 @@
                 <w:sz w:val="17"/>
                 <w:szCs w:val="17"/>
               </w:rPr>
-              <w:t xml:space="preserve">34–45 s</w:t>
+              <w:t xml:space="preserve">36–48 s</w:t>
             </w:r>
           </w:p>
         </w:tc>
@@ -1718,7 +1718,7 @@
                 <w:sz w:val="21"/>
                 <w:szCs w:val="21"/>
               </w:rPr>
-              <w:t xml:space="preserve">Y en las zonas comunes: coworking para trabajar, teatrino para maratonear tu serie, sala de juntas, gimnasio dotado y dos terrazas, una para adultos y otra para niños y jóvenes.</w:t>
+              <w:t xml:space="preserve">Y un privilegio que solo disfrutan los residentes de DOMUS: coworking, teatrino para maratonear tu serie, sala de juntas, gimnasio dotado y dos terrazas, una para adultos y otra para niños y jóvenes.</w:t>
             </w:r>
           </w:p>
         </w:tc>
@@ -1787,7 +1787,7 @@
                 <w:sz w:val="17"/>
                 <w:szCs w:val="17"/>
               </w:rPr>
-              <w:t xml:space="preserve">45–52 s</w:t>
+              <w:t xml:space="preserve">48–56 s</w:t>
             </w:r>
           </w:p>
         </w:tc>
@@ -1818,7 +1818,7 @@
                 <w:sz w:val="21"/>
                 <w:szCs w:val="21"/>
               </w:rPr>
-              <w:t xml:space="preserve">1.520 millones, última unidad. Escríbenos y agendamos tu visita.</w:t>
+              <w:t xml:space="preserve">Última unidad, entrega inmediata: quien la vea primero se la lleva. 1.520 millones. Escríbenos y agenda tu visita privada.</w:t>
             </w:r>
           </w:p>
         </w:tc>
@@ -1860,7 +1860,7 @@
                 <w:sz w:val="18"/>
                 <w:szCs w:val="18"/>
               </w:rPr>
-              <w:t xml:space="preserve">Escríbenos para agendar tu visita</w:t>
+              <w:t xml:space="preserve">Última unidad · Agenda tu visita privada</w:t>
             </w:r>
           </w:p>
         </w:tc>

</xml_diff>

<commit_message>
Guiones DOMUS: CTA con loop abierto y palabra clave en comentarios
Co-Authored-By: Claude Opus 5.5 <noreply@anthropic.com>
Claude-Session: https://claude.ai/code/session_01GNAWuRBmVuoQKTgJ9U3tZK
</commit_message>
<xml_diff>
--- a/propiedades/domus-san-patricio-5a/Guiones DOMUS San Patricio.docx
+++ b/propiedades/domus-san-patricio-5a/Guiones DOMUS San Patricio.docx
@@ -857,7 +857,7 @@
           <w:sz w:val="16"/>
           <w:szCs w:val="16"/>
         </w:rPr>
-        <w:t xml:space="preserve">GUION 1 · ~60 S · 157 PALABRAS</w:t>
+        <w:t xml:space="preserve">GUION 1 · ~64 S · 172 PALABRAS</w:t>
       </w:r>
     </w:p>
     <w:p>
@@ -894,7 +894,7 @@
           <w:sz w:val="21"/>
           <w:szCs w:val="21"/>
         </w:rPr>
-        <w:t xml:space="preserve">El precio va en la primera frase para segmentar, y todo el guion transmite exclusividad, alta demanda y privilegio: último de la colección, entrega inmediata, las demás unidades ya tienen dueño y visita privada.</w:t>
+        <w:t xml:space="preserve">El precio va en la primera frase para segmentar, y todo el guion transmite exclusividad, alta demanda y privilegio: último de la colección, entrega inmediata, las demás unidades ya tienen dueño y visita privada. El cierre deja un loop abierto para que pidan el recorrido completo en comentarios.</w:t>
       </w:r>
     </w:p>
     <w:tbl>
@@ -1787,7 +1787,7 @@
                 <w:sz w:val="17"/>
                 <w:szCs w:val="17"/>
               </w:rPr>
-              <w:t xml:space="preserve">48–56 s</w:t>
+              <w:t xml:space="preserve">48–64 s</w:t>
             </w:r>
           </w:p>
         </w:tc>
@@ -1818,7 +1818,27 @@
                 <w:sz w:val="21"/>
                 <w:szCs w:val="21"/>
               </w:rPr>
-              <w:t xml:space="preserve">Última unidad, entrega inmediata: quien la vea primero se la lleva. 1.520 millones. Escríbenos y agenda tu visita privada.</w:t>
+              <w:t xml:space="preserve">Última unidad, entrega inmediata: quien la vea primero se la lleva. 1.520 millones. </w:t>
+            </w:r>
+            <w:r>
+              <w:rPr>
+                <w:rFonts w:ascii="Georgia" w:cs="Georgia" w:eastAsia="Georgia" w:hAnsi="Georgia"/>
+                <w:b/>
+                <w:bCs/>
+                <w:color w:val="1C1714"/>
+                <w:sz w:val="21"/>
+                <w:szCs w:val="21"/>
+              </w:rPr>
+              <w:t xml:space="preserve">Y aún hay espacios que no te he mostrado.</w:t>
+            </w:r>
+            <w:r>
+              <w:rPr>
+                <w:rFonts w:ascii="Georgia" w:cs="Georgia" w:eastAsia="Georgia" w:hAnsi="Georgia"/>
+                <w:color w:val="1C1714"/>
+                <w:sz w:val="21"/>
+                <w:szCs w:val="21"/>
+              </w:rPr>
+              <w:t xml:space="preserve"> Comenta DOMUS y te envío el recorrido completo para tu visita privada.</w:t>
             </w:r>
           </w:p>
         </w:tc>
@@ -1860,7 +1880,7 @@
                 <w:sz w:val="18"/>
                 <w:szCs w:val="18"/>
               </w:rPr>
-              <w:t xml:space="preserve">Última unidad · Agenda tu visita privada</w:t>
+              <w:t xml:space="preserve">Comenta DOMUS</w:t>
             </w:r>
           </w:p>
         </w:tc>
@@ -3382,7 +3402,7 @@
                 <w:sz w:val="21"/>
                 <w:szCs w:val="21"/>
               </w:rPr>
-              <w:t xml:space="preserve"> Si quieres verlos todos, pídenos más información y agendemos una visita.</w:t>
+              <w:t xml:space="preserve"> Si quieres verlos todos, comenta DOMUS y te enviamos el recorrido completo para agendar tu visita.</w:t>
             </w:r>
           </w:p>
         </w:tc>
@@ -3413,7 +3433,18 @@
                 <w:sz w:val="18"/>
                 <w:szCs w:val="18"/>
               </w:rPr>
-              <w:t xml:space="preserve">El agente camina hacia una puerta cerrada y sale de cuadro</w:t>
+              <w:t xml:space="preserve">El agente camina hacia una puerta cerrada y sale de cuadro. Texto: </w:t>
+            </w:r>
+            <w:r>
+              <w:rPr>
+                <w:rFonts w:ascii="Calibri" w:cs="Calibri" w:eastAsia="Calibri" w:hAnsi="Calibri"/>
+                <w:b/>
+                <w:bCs/>
+                <w:color w:val="5A4E42"/>
+                <w:sz w:val="18"/>
+                <w:szCs w:val="18"/>
+              </w:rPr>
+              <w:t xml:space="preserve">Comenta DOMUS</w:t>
             </w:r>
           </w:p>
         </w:tc>

</xml_diff>

<commit_message>
Guiones DOMUS más cortos: 40 s y 50 s
Co-Authored-By: Claude Opus 5.5 <noreply@anthropic.com>
Claude-Session: https://claude.ai/code/session_01GNAWuRBmVuoQKTgJ9U3tZK
</commit_message>
<xml_diff>
--- a/propiedades/domus-san-patricio-5a/Guiones DOMUS San Patricio.docx
+++ b/propiedades/domus-san-patricio-5a/Guiones DOMUS San Patricio.docx
@@ -857,7 +857,7 @@
           <w:sz w:val="16"/>
           <w:szCs w:val="16"/>
         </w:rPr>
-        <w:t xml:space="preserve">GUION 1 · ~64 S · 172 PALABRAS</w:t>
+        <w:t xml:space="preserve">GUION 1 · ~40 S · 100 PALABRAS</w:t>
       </w:r>
     </w:p>
     <w:p>
@@ -894,7 +894,7 @@
           <w:sz w:val="21"/>
           <w:szCs w:val="21"/>
         </w:rPr>
-        <w:t xml:space="preserve">El precio va en la primera frase para segmentar, y todo el guion transmite exclusividad, alta demanda y privilegio: último de la colección, entrega inmediata, las demás unidades ya tienen dueño y visita privada. El cierre deja un loop abierto para que pidan el recorrido completo en comentarios.</w:t>
+        <w:t xml:space="preserve">Abre con el precio para segmentar y transmite exclusividad, alta demanda y privilegio. El cierre deja un loop abierto para que pidan el recorrido en comentarios.</w:t>
       </w:r>
     </w:p>
     <w:tbl>
@@ -1085,7 +1085,7 @@
                 <w:sz w:val="21"/>
                 <w:szCs w:val="21"/>
               </w:rPr>
-              <w:t xml:space="preserve">Por 1.520 millones, este es el último apartamento de la colección DOMUS San Patricio, en el sector donde viven las personas más exclusivas de Bogotá.</w:t>
+              <w:t xml:space="preserve">Por 1.520 millones, el último apartamento de la colección DOMUS San Patricio, en el sector donde viven las personas más exclusivas de Bogotá.</w:t>
             </w:r>
           </w:p>
         </w:tc>
@@ -1165,7 +1165,7 @@
                 <w:sz w:val="17"/>
                 <w:szCs w:val="17"/>
               </w:rPr>
-              <w:t xml:space="preserve">5–10 s</w:t>
+              <w:t xml:space="preserve">5–9 s</w:t>
             </w:r>
           </w:p>
         </w:tc>
@@ -1196,7 +1196,7 @@
                 <w:sz w:val="21"/>
                 <w:szCs w:val="21"/>
               </w:rPr>
-              <w:t xml:space="preserve">116 metros cuadrados, más de 500 de zonas comunes y entrega inmediata. Las demás unidades ya tienen dueño. Acompáñame.</w:t>
+              <w:t xml:space="preserve">116 metros, más de 500 de zonas comunes y entrega inmediata. Acompáñame.</w:t>
             </w:r>
           </w:p>
         </w:tc>
@@ -1276,7 +1276,7 @@
                 <w:sz w:val="17"/>
                 <w:szCs w:val="17"/>
               </w:rPr>
-              <w:t xml:space="preserve">10–17 s</w:t>
+              <w:t xml:space="preserve">9–13 s</w:t>
             </w:r>
           </w:p>
         </w:tc>
@@ -1307,7 +1307,7 @@
                 <w:sz w:val="21"/>
                 <w:szCs w:val="21"/>
               </w:rPr>
-              <w:t xml:space="preserve">Al entrar te recibe la sala, con una ventana de piso a techo totalmente insonorizada, conectada con la cocina estilo americano.</w:t>
+              <w:t xml:space="preserve">Sala con ventana de piso a techo insonorizada y cocina americana.</w:t>
             </w:r>
           </w:p>
         </w:tc>
@@ -1338,7 +1338,7 @@
                 <w:sz w:val="18"/>
                 <w:szCs w:val="18"/>
               </w:rPr>
-              <w:t xml:space="preserve">Plano abierto de la ventana; paneo hacia la cocina</w:t>
+              <w:t xml:space="preserve">Ventana; paneo a la cocina</w:t>
             </w:r>
           </w:p>
         </w:tc>
@@ -1376,7 +1376,7 @@
                 <w:sz w:val="17"/>
                 <w:szCs w:val="17"/>
               </w:rPr>
-              <w:t xml:space="preserve">17–23 s</w:t>
+              <w:t xml:space="preserve">13–18 s</w:t>
             </w:r>
           </w:p>
         </w:tc>
@@ -1407,7 +1407,7 @@
                 <w:sz w:val="21"/>
                 <w:szCs w:val="21"/>
               </w:rPr>
-              <w:t xml:space="preserve">Sigues y llegas al family room, que conecta con las dos habitaciones.</w:t>
+              <w:t xml:space="preserve">Family room, dos habitaciones y una principal con walking closet, baño y balcón privado.</w:t>
             </w:r>
           </w:p>
         </w:tc>
@@ -1438,7 +1438,7 @@
                 <w:sz w:val="18"/>
                 <w:szCs w:val="18"/>
               </w:rPr>
-              <w:t xml:space="preserve">El agente camina por el family room hacia las habitaciones</w:t>
+              <w:t xml:space="preserve">Family room → walking closet → balcón</w:t>
             </w:r>
           </w:p>
         </w:tc>
@@ -1476,7 +1476,7 @@
                 <w:sz w:val="17"/>
                 <w:szCs w:val="17"/>
               </w:rPr>
-              <w:t xml:space="preserve">23–32 s</w:t>
+              <w:t xml:space="preserve">18–20 s</w:t>
             </w:r>
           </w:p>
         </w:tc>
@@ -1507,7 +1507,7 @@
                 <w:sz w:val="21"/>
                 <w:szCs w:val="21"/>
               </w:rPr>
-              <w:t xml:space="preserve">En la principal entras por un walking closet amplio hasta tu baño privado, y tienes tu propio balcón. El otro baño es social.</w:t>
+              <w:t xml:space="preserve">Dos parqueaderos y depósito.</w:t>
             </w:r>
           </w:p>
         </w:tc>
@@ -1538,7 +1538,18 @@
                 <w:sz w:val="18"/>
                 <w:szCs w:val="18"/>
               </w:rPr>
-              <w:t xml:space="preserve">Walking closet → baño → el agente sale al balcón</w:t>
+              <w:t xml:space="preserve">Sótano. Texto: </w:t>
+            </w:r>
+            <w:r>
+              <w:rPr>
+                <w:rFonts w:ascii="Calibri" w:cs="Calibri" w:eastAsia="Calibri" w:hAnsi="Calibri"/>
+                <w:b/>
+                <w:bCs/>
+                <w:color w:val="5A4E42"/>
+                <w:sz w:val="18"/>
+                <w:szCs w:val="18"/>
+              </w:rPr>
+              <w:t xml:space="preserve">2 parqueaderos + depósito</w:t>
             </w:r>
           </w:p>
         </w:tc>
@@ -1576,7 +1587,7 @@
                 <w:sz w:val="17"/>
                 <w:szCs w:val="17"/>
               </w:rPr>
-              <w:t xml:space="preserve">32–36 s</w:t>
+              <w:t xml:space="preserve">20–27 s</w:t>
             </w:r>
           </w:p>
         </w:tc>
@@ -1607,7 +1618,7 @@
                 <w:sz w:val="21"/>
                 <w:szCs w:val="21"/>
               </w:rPr>
-              <w:t xml:space="preserve">Además, dos parqueaderos y depósito.</w:t>
+              <w:t xml:space="preserve">Y solo para residentes: coworking, teatrino, sala de juntas, gimnasio y dos terrazas.</w:t>
             </w:r>
           </w:p>
         </w:tc>
@@ -1638,18 +1649,7 @@
                 <w:sz w:val="18"/>
                 <w:szCs w:val="18"/>
               </w:rPr>
-              <w:t xml:space="preserve">Corte rápido al sótano. Texto: </w:t>
-            </w:r>
-            <w:r>
-              <w:rPr>
-                <w:rFonts w:ascii="Calibri" w:cs="Calibri" w:eastAsia="Calibri" w:hAnsi="Calibri"/>
-                <w:b/>
-                <w:bCs/>
-                <w:color w:val="5A4E42"/>
-                <w:sz w:val="18"/>
-                <w:szCs w:val="18"/>
-              </w:rPr>
-              <w:t xml:space="preserve">2 parqueaderos + depósito</w:t>
+              <w:t xml:space="preserve">Un plano de 1,5 s por zona común</w:t>
             </w:r>
           </w:p>
         </w:tc>
@@ -1687,7 +1687,7 @@
                 <w:sz w:val="17"/>
                 <w:szCs w:val="17"/>
               </w:rPr>
-              <w:t xml:space="preserve">36–48 s</w:t>
+              <w:t xml:space="preserve">27–40 s</w:t>
             </w:r>
           </w:p>
         </w:tc>
@@ -1718,7 +1718,27 @@
                 <w:sz w:val="21"/>
                 <w:szCs w:val="21"/>
               </w:rPr>
-              <w:t xml:space="preserve">Y un privilegio que solo disfrutan los residentes de DOMUS: coworking, teatrino para maratonear tu serie, sala de juntas, gimnasio dotado y dos terrazas, una para adultos y otra para niños y jóvenes.</w:t>
+              <w:t xml:space="preserve">Última unidad: quien la vea primero se la lleva. </w:t>
+            </w:r>
+            <w:r>
+              <w:rPr>
+                <w:rFonts w:ascii="Georgia" w:cs="Georgia" w:eastAsia="Georgia" w:hAnsi="Georgia"/>
+                <w:b/>
+                <w:bCs/>
+                <w:color w:val="1C1714"/>
+                <w:sz w:val="21"/>
+                <w:szCs w:val="21"/>
+              </w:rPr>
+              <w:t xml:space="preserve">Y aún hay espacios que no te he mostrado.</w:t>
+            </w:r>
+            <w:r>
+              <w:rPr>
+                <w:rFonts w:ascii="Georgia" w:cs="Georgia" w:eastAsia="Georgia" w:hAnsi="Georgia"/>
+                <w:color w:val="1C1714"/>
+                <w:sz w:val="21"/>
+                <w:szCs w:val="21"/>
+              </w:rPr>
+              <w:t xml:space="preserve"> Comenta DOMUS y te envío el recorrido completo.</w:t>
             </w:r>
           </w:p>
         </w:tc>
@@ -1749,127 +1769,7 @@
                 <w:sz w:val="18"/>
                 <w:szCs w:val="18"/>
               </w:rPr>
-              <w:t xml:space="preserve">Un plano de 2 s por zona común</w:t>
-            </w:r>
-          </w:p>
-        </w:tc>
-      </w:tr>
-      <w:tr>
-        <w:trPr>
-          <w:cantSplit/>
-        </w:trPr>
-        <w:tc>
-          <w:tcPr>
-            <w:tcW w:type="dxa" w:w="1000"/>
-            <w:tcBorders>
-              <w:top w:val="none" w:color="FFFFFF" w:sz="0"/>
-              <w:left w:val="none" w:color="FFFFFF" w:sz="0"/>
-              <w:bottom w:val="single" w:color="D8CDB6" w:sz="4"/>
-              <w:right w:val="none" w:color="FFFFFF" w:sz="0"/>
-            </w:tcBorders>
-            <w:tcMar>
-              <w:top w:type="dxa" w:w="90"/>
-              <w:left w:type="dxa" w:w="100"/>
-              <w:bottom w:type="dxa" w:w="90"/>
-              <w:right w:type="dxa" w:w="100"/>
-            </w:tcMar>
-          </w:tcPr>
-          <w:p>
-            <w:pPr>
-              <w:spacing w:after="0" w:line="276"/>
-            </w:pPr>
-            <w:r>
-              <w:rPr>
-                <w:rFonts w:ascii="Calibri" w:cs="Calibri" w:eastAsia="Calibri" w:hAnsi="Calibri"/>
-                <w:b/>
-                <w:bCs/>
-                <w:color w:val="1C1714"/>
-                <w:sz w:val="17"/>
-                <w:szCs w:val="17"/>
-              </w:rPr>
-              <w:t xml:space="preserve">48–64 s</w:t>
-            </w:r>
-          </w:p>
-        </w:tc>
-        <w:tc>
-          <w:tcPr>
-            <w:tcW w:type="dxa" w:w="5160"/>
-            <w:tcBorders>
-              <w:top w:val="none" w:color="FFFFFF" w:sz="0"/>
-              <w:left w:val="none" w:color="FFFFFF" w:sz="0"/>
-              <w:bottom w:val="single" w:color="D8CDB6" w:sz="4"/>
-              <w:right w:val="none" w:color="FFFFFF" w:sz="0"/>
-            </w:tcBorders>
-            <w:tcMar>
-              <w:top w:type="dxa" w:w="90"/>
-              <w:left w:type="dxa" w:w="100"/>
-              <w:bottom w:type="dxa" w:w="90"/>
-              <w:right w:type="dxa" w:w="100"/>
-            </w:tcMar>
-          </w:tcPr>
-          <w:p>
-            <w:pPr>
-              <w:spacing w:after="0" w:line="276"/>
-            </w:pPr>
-            <w:r>
-              <w:rPr>
-                <w:rFonts w:ascii="Georgia" w:cs="Georgia" w:eastAsia="Georgia" w:hAnsi="Georgia"/>
-                <w:color w:val="1C1714"/>
-                <w:sz w:val="21"/>
-                <w:szCs w:val="21"/>
-              </w:rPr>
-              <w:t xml:space="preserve">Última unidad, entrega inmediata: quien la vea primero se la lleva. 1.520 millones. </w:t>
-            </w:r>
-            <w:r>
-              <w:rPr>
-                <w:rFonts w:ascii="Georgia" w:cs="Georgia" w:eastAsia="Georgia" w:hAnsi="Georgia"/>
-                <w:b/>
-                <w:bCs/>
-                <w:color w:val="1C1714"/>
-                <w:sz w:val="21"/>
-                <w:szCs w:val="21"/>
-              </w:rPr>
-              <w:t xml:space="preserve">Y aún hay espacios que no te he mostrado.</w:t>
-            </w:r>
-            <w:r>
-              <w:rPr>
-                <w:rFonts w:ascii="Georgia" w:cs="Georgia" w:eastAsia="Georgia" w:hAnsi="Georgia"/>
-                <w:color w:val="1C1714"/>
-                <w:sz w:val="21"/>
-                <w:szCs w:val="21"/>
-              </w:rPr>
-              <w:t xml:space="preserve"> Comenta DOMUS y te envío el recorrido completo para tu visita privada.</w:t>
-            </w:r>
-          </w:p>
-        </w:tc>
-        <w:tc>
-          <w:tcPr>
-            <w:tcW w:type="dxa" w:w="3200"/>
-            <w:tcBorders>
-              <w:top w:val="none" w:color="FFFFFF" w:sz="0"/>
-              <w:left w:val="none" w:color="FFFFFF" w:sz="0"/>
-              <w:bottom w:val="single" w:color="D8CDB6" w:sz="4"/>
-              <w:right w:val="none" w:color="FFFFFF" w:sz="0"/>
-            </w:tcBorders>
-            <w:tcMar>
-              <w:top w:type="dxa" w:w="90"/>
-              <w:left w:type="dxa" w:w="100"/>
-              <w:bottom w:type="dxa" w:w="90"/>
-              <w:right w:type="dxa" w:w="100"/>
-            </w:tcMar>
-          </w:tcPr>
-          <w:p>
-            <w:pPr>
-              <w:spacing w:after="0" w:line="276"/>
-            </w:pPr>
-            <w:r>
-              <w:rPr>
-                <w:rFonts w:ascii="Calibri" w:cs="Calibri" w:eastAsia="Calibri" w:hAnsi="Calibri"/>
-                <w:color w:val="5A4E42"/>
-                <w:sz w:val="18"/>
-                <w:szCs w:val="18"/>
-              </w:rPr>
-              <w:t xml:space="preserve">Agente a cámara en una terraza. Texto: </w:t>
+              <w:t xml:space="preserve">Agente frente a una puerta cerrada. Texto: </w:t>
             </w:r>
             <w:r>
               <w:rPr>
@@ -1900,7 +1800,7 @@
           <w:sz w:val="16"/>
           <w:szCs w:val="16"/>
         </w:rPr>
-        <w:t xml:space="preserve">GUION 2 · ~75 S · 188 PALABRAS</w:t>
+        <w:t xml:space="preserve">GUION 2 · ~50 S · 123 PALABRAS</w:t>
       </w:r>
     </w:p>
     <w:p>
@@ -1937,7 +1837,7 @@
           <w:sz w:val="21"/>
           <w:szCs w:val="21"/>
         </w:rPr>
-        <w:t xml:space="preserve">Tu libreto con los loops añadidos (en negrita): cada uno promete algo mejor justo antes del siguiente espacio, y el precio se guarda hasta el final porque el titular lo deja abierto ("ni por este precio").</w:t>
+        <w:t xml:space="preserve">Tu libreto condensado, con los loops en negrita: cada uno promete algo mejor justo antes del siguiente espacio, y el precio se guarda hasta el final.</w:t>
       </w:r>
     </w:p>
     <w:tbl>
@@ -2097,7 +1997,7 @@
                 <w:sz w:val="17"/>
                 <w:szCs w:val="17"/>
               </w:rPr>
-              <w:t xml:space="preserve">0–7 s</w:t>
+              <w:t xml:space="preserve">0–6 s</w:t>
             </w:r>
           </w:p>
         </w:tc>
@@ -2128,7 +2028,7 @@
                 <w:sz w:val="21"/>
                 <w:szCs w:val="21"/>
               </w:rPr>
-              <w:t xml:space="preserve">Este apartamento en venta tiene 116 metros cuadrados, más de 500 de zonas comunes, y está en el sector donde todos quieren vivir en Bogotá: San Patricio.</w:t>
+              <w:t xml:space="preserve">Este apartamento tiene 116 metros, más de 500 de zonas comunes y está en San Patricio, el sector donde todos quieren vivir en Bogotá.</w:t>
             </w:r>
           </w:p>
         </w:tc>
@@ -2208,7 +2108,7 @@
                 <w:sz w:val="17"/>
                 <w:szCs w:val="17"/>
               </w:rPr>
-              <w:t xml:space="preserve">7–12 s</w:t>
+              <w:t xml:space="preserve">6–9 s</w:t>
             </w:r>
           </w:p>
         </w:tc>
@@ -2239,7 +2139,7 @@
                 <w:sz w:val="21"/>
                 <w:szCs w:val="21"/>
               </w:rPr>
-              <w:t xml:space="preserve">Acompáñame a descubrir por qué no hay otro apartamento así en este sector, ni por este precio.</w:t>
+              <w:t xml:space="preserve">Te muestro por qué no hay otro igual, ni por este precio.</w:t>
             </w:r>
           </w:p>
         </w:tc>
@@ -2319,7 +2219,7 @@
                 <w:sz w:val="17"/>
                 <w:szCs w:val="17"/>
               </w:rPr>
-              <w:t xml:space="preserve">12–20 s</w:t>
+              <w:t xml:space="preserve">9–14 s</w:t>
             </w:r>
           </w:p>
         </w:tc>
@@ -2350,7 +2250,7 @@
                 <w:sz w:val="21"/>
                 <w:szCs w:val="21"/>
               </w:rPr>
-              <w:t xml:space="preserve">Al entrar te recibe este espacio con una ventana de piso a techo, completamente insonorizada, que conecta de forma perfecta con la cocina estilo americano.</w:t>
+              <w:t xml:space="preserve">Te recibe una ventana de piso a techo insonorizada, conectada con la cocina americana.</w:t>
             </w:r>
           </w:p>
         </w:tc>
@@ -2381,7 +2281,7 @@
                 <w:sz w:val="18"/>
                 <w:szCs w:val="18"/>
               </w:rPr>
-              <w:t xml:space="preserve">Plano abierto de la ventana; paneo hacia la cocina</w:t>
+              <w:t xml:space="preserve">Ventana; paneo a la cocina</w:t>
             </w:r>
           </w:p>
         </w:tc>
@@ -2419,7 +2319,7 @@
                 <w:sz w:val="17"/>
                 <w:szCs w:val="17"/>
               </w:rPr>
-              <w:t xml:space="preserve">20–23 s</w:t>
+              <w:t xml:space="preserve">14–16 s</w:t>
             </w:r>
           </w:p>
         </w:tc>
@@ -2483,7 +2383,7 @@
                 <w:sz w:val="18"/>
                 <w:szCs w:val="18"/>
               </w:rPr>
-              <w:t xml:space="preserve">El agente mira a cámara y sigue caminando</w:t>
+              <w:t xml:space="preserve">Mira a cámara y sigue caminando</w:t>
             </w:r>
           </w:p>
         </w:tc>
@@ -2521,7 +2421,7 @@
                 <w:sz w:val="17"/>
                 <w:szCs w:val="17"/>
               </w:rPr>
-              <w:t xml:space="preserve">23–29 s</w:t>
+              <w:t xml:space="preserve">16–22 s</w:t>
             </w:r>
           </w:p>
         </w:tc>
@@ -2552,7 +2452,27 @@
                 <w:sz w:val="21"/>
                 <w:szCs w:val="21"/>
               </w:rPr>
-              <w:t xml:space="preserve">Al continuar tienes este family room, que conecta con las dos habitaciones.</w:t>
+              <w:t xml:space="preserve">Family room, dos habitaciones, </w:t>
+            </w:r>
+            <w:r>
+              <w:rPr>
+                <w:rFonts w:ascii="Georgia" w:cs="Georgia" w:eastAsia="Georgia" w:hAnsi="Georgia"/>
+                <w:b/>
+                <w:bCs/>
+                <w:color w:val="1C1714"/>
+                <w:sz w:val="21"/>
+                <w:szCs w:val="21"/>
+              </w:rPr>
+              <w:t xml:space="preserve">y la principal guarda una sorpresa:</w:t>
+            </w:r>
+            <w:r>
+              <w:rPr>
+                <w:rFonts w:ascii="Georgia" w:cs="Georgia" w:eastAsia="Georgia" w:hAnsi="Georgia"/>
+                <w:color w:val="1C1714"/>
+                <w:sz w:val="21"/>
+                <w:szCs w:val="21"/>
+              </w:rPr>
+              <w:t xml:space="preserve"> walking closet, baño privado y balcón.</w:t>
             </w:r>
           </w:p>
         </w:tc>
@@ -2583,7 +2503,7 @@
                 <w:sz w:val="18"/>
                 <w:szCs w:val="18"/>
               </w:rPr>
-              <w:t xml:space="preserve">Family room → puertas de las habitaciones</w:t>
+              <w:t xml:space="preserve">Family room → se detiene en la puerta → walking closet → balcón</w:t>
             </w:r>
           </w:p>
         </w:tc>
@@ -2621,7 +2541,7 @@
                 <w:sz w:val="17"/>
                 <w:szCs w:val="17"/>
               </w:rPr>
-              <w:t xml:space="preserve">29–31 s</w:t>
+              <w:t xml:space="preserve">22–25 s</w:t>
             </w:r>
           </w:p>
         </w:tc>
@@ -2654,7 +2574,16 @@
                 <w:sz w:val="21"/>
                 <w:szCs w:val="21"/>
               </w:rPr>
-              <w:t xml:space="preserve">Y la habitación principal guarda una sorpresa.</w:t>
+              <w:t xml:space="preserve">Y eso no es todo:</w:t>
+            </w:r>
+            <w:r>
+              <w:rPr>
+                <w:rFonts w:ascii="Georgia" w:cs="Georgia" w:eastAsia="Georgia" w:hAnsi="Georgia"/>
+                <w:color w:val="1C1714"/>
+                <w:sz w:val="21"/>
+                <w:szCs w:val="21"/>
+              </w:rPr>
+              <w:t xml:space="preserve"> dos parqueaderos y depósito.</w:t>
             </w:r>
           </w:p>
         </w:tc>
@@ -2685,7 +2614,7 @@
                 <w:sz w:val="18"/>
                 <w:szCs w:val="18"/>
               </w:rPr>
-              <w:t xml:space="preserve">El agente se detiene frente a la puerta de la principal</w:t>
+              <w:t xml:space="preserve">Corte seco al sótano</w:t>
             </w:r>
           </w:p>
         </w:tc>
@@ -2723,7 +2652,7 @@
                 <w:sz w:val="17"/>
                 <w:szCs w:val="17"/>
               </w:rPr>
-              <w:t xml:space="preserve">31–41 s</w:t>
+              <w:t xml:space="preserve">25–34 s</w:t>
             </w:r>
           </w:p>
         </w:tc>
@@ -2754,7 +2683,7 @@
                 <w:sz w:val="21"/>
                 <w:szCs w:val="21"/>
               </w:rPr>
-              <w:t xml:space="preserve">Entras por un walking closet amplio hasta su baño privado. El otro baño es social. Y en esta misma habitación tienes tu propio balcón privado.</w:t>
+              <w:t xml:space="preserve">Más 500 metros de zonas comunes: coworking, teatrino, sala de juntas, gimnasio y dos terrazas, una para adultos y otra para niños.</w:t>
             </w:r>
           </w:p>
         </w:tc>
@@ -2785,7 +2714,7 @@
                 <w:sz w:val="18"/>
                 <w:szCs w:val="18"/>
               </w:rPr>
-              <w:t xml:space="preserve">Walking closet → baño → el agente abre el balcón</w:t>
+              <w:t xml:space="preserve">Un plano de 1,5 s por zona común</w:t>
             </w:r>
           </w:p>
         </w:tc>
@@ -2823,7 +2752,7 @@
                 <w:sz w:val="17"/>
                 <w:szCs w:val="17"/>
               </w:rPr>
-              <w:t xml:space="preserve">41–44 s</w:t>
+              <w:t xml:space="preserve">34–39 s</w:t>
             </w:r>
           </w:p>
         </w:tc>
@@ -2856,7 +2785,16 @@
                 <w:sz w:val="21"/>
                 <w:szCs w:val="21"/>
               </w:rPr>
-              <w:t xml:space="preserve">Y eso no es todo lo que tiene este apartamento.</w:t>
+              <w:t xml:space="preserve">¿Y el precio?</w:t>
+            </w:r>
+            <w:r>
+              <w:rPr>
+                <w:rFonts w:ascii="Georgia" w:cs="Georgia" w:eastAsia="Georgia" w:hAnsi="Georgia"/>
+                <w:color w:val="1C1714"/>
+                <w:sz w:val="21"/>
+                <w:szCs w:val="21"/>
+              </w:rPr>
+              <w:t xml:space="preserve"> Es la última unidad: 1.520 millones.</w:t>
             </w:r>
           </w:p>
         </w:tc>
@@ -2887,7 +2825,18 @@
                 <w:sz w:val="18"/>
                 <w:szCs w:val="18"/>
               </w:rPr>
-              <w:t xml:space="preserve">Corte seco</w:t>
+              <w:t xml:space="preserve">Agente en la terraza. Texto: </w:t>
+            </w:r>
+            <w:r>
+              <w:rPr>
+                <w:rFonts w:ascii="Calibri" w:cs="Calibri" w:eastAsia="Calibri" w:hAnsi="Calibri"/>
+                <w:b/>
+                <w:bCs/>
+                <w:color w:val="5A4E42"/>
+                <w:sz w:val="18"/>
+                <w:szCs w:val="18"/>
+              </w:rPr>
+              <w:t xml:space="preserve">$1.520M · Última unidad</w:t>
             </w:r>
           </w:p>
         </w:tc>
@@ -2925,7 +2874,7 @@
                 <w:sz w:val="17"/>
                 <w:szCs w:val="17"/>
               </w:rPr>
-              <w:t xml:space="preserve">44–47 s</w:t>
+              <w:t xml:space="preserve">39–50 s</w:t>
             </w:r>
           </w:p>
         </w:tc>
@@ -2952,11 +2901,22 @@
             <w:r>
               <w:rPr>
                 <w:rFonts w:ascii="Georgia" w:cs="Georgia" w:eastAsia="Georgia" w:hAnsi="Georgia"/>
+                <w:b/>
+                <w:bCs/>
                 <w:color w:val="1C1714"/>
                 <w:sz w:val="21"/>
                 <w:szCs w:val="21"/>
               </w:rPr>
-              <w:t xml:space="preserve">Tendrás dos parqueaderos y un depósito.</w:t>
+              <w:t xml:space="preserve">Aún quedan espacios por mostrarte.</w:t>
+            </w:r>
+            <w:r>
+              <w:rPr>
+                <w:rFonts w:ascii="Georgia" w:cs="Georgia" w:eastAsia="Georgia" w:hAnsi="Georgia"/>
+                <w:color w:val="1C1714"/>
+                <w:sz w:val="21"/>
+                <w:szCs w:val="21"/>
+              </w:rPr>
+              <w:t xml:space="preserve"> Comenta DOMUS y te enviamos el recorrido completo.</w:t>
             </w:r>
           </w:p>
         </w:tc>
@@ -2987,453 +2947,7 @@
                 <w:sz w:val="18"/>
                 <w:szCs w:val="18"/>
               </w:rPr>
-              <w:t xml:space="preserve">Sótano. Texto: </w:t>
-            </w:r>
-            <w:r>
-              <w:rPr>
-                <w:rFonts w:ascii="Calibri" w:cs="Calibri" w:eastAsia="Calibri" w:hAnsi="Calibri"/>
-                <w:b/>
-                <w:bCs/>
-                <w:color w:val="5A4E42"/>
-                <w:sz w:val="18"/>
-                <w:szCs w:val="18"/>
-              </w:rPr>
-              <w:t xml:space="preserve">2 parqueaderos + depósito</w:t>
-            </w:r>
-          </w:p>
-        </w:tc>
-      </w:tr>
-      <w:tr>
-        <w:trPr>
-          <w:cantSplit/>
-        </w:trPr>
-        <w:tc>
-          <w:tcPr>
-            <w:tcW w:type="dxa" w:w="1000"/>
-            <w:tcBorders>
-              <w:top w:val="none" w:color="FFFFFF" w:sz="0"/>
-              <w:left w:val="none" w:color="FFFFFF" w:sz="0"/>
-              <w:bottom w:val="single" w:color="D8CDB6" w:sz="4"/>
-              <w:right w:val="none" w:color="FFFFFF" w:sz="0"/>
-            </w:tcBorders>
-            <w:tcMar>
-              <w:top w:type="dxa" w:w="90"/>
-              <w:left w:type="dxa" w:w="100"/>
-              <w:bottom w:type="dxa" w:w="90"/>
-              <w:right w:type="dxa" w:w="100"/>
-            </w:tcMar>
-          </w:tcPr>
-          <w:p>
-            <w:pPr>
-              <w:spacing w:after="0" w:line="276"/>
-            </w:pPr>
-            <w:r>
-              <w:rPr>
-                <w:rFonts w:ascii="Calibri" w:cs="Calibri" w:eastAsia="Calibri" w:hAnsi="Calibri"/>
-                <w:b/>
-                <w:bCs/>
-                <w:color w:val="1C1714"/>
-                <w:sz w:val="17"/>
-                <w:szCs w:val="17"/>
-              </w:rPr>
-              <w:t xml:space="preserve">47–50 s</w:t>
-            </w:r>
-          </w:p>
-        </w:tc>
-        <w:tc>
-          <w:tcPr>
-            <w:tcW w:type="dxa" w:w="5160"/>
-            <w:tcBorders>
-              <w:top w:val="none" w:color="FFFFFF" w:sz="0"/>
-              <w:left w:val="none" w:color="FFFFFF" w:sz="0"/>
-              <w:bottom w:val="single" w:color="D8CDB6" w:sz="4"/>
-              <w:right w:val="none" w:color="FFFFFF" w:sz="0"/>
-            </w:tcBorders>
-            <w:tcMar>
-              <w:top w:type="dxa" w:w="90"/>
-              <w:left w:type="dxa" w:w="100"/>
-              <w:bottom w:type="dxa" w:w="90"/>
-              <w:right w:type="dxa" w:w="100"/>
-            </w:tcMar>
-          </w:tcPr>
-          <w:p>
-            <w:pPr>
-              <w:spacing w:after="0" w:line="276"/>
-            </w:pPr>
-            <w:r>
-              <w:rPr>
-                <w:rFonts w:ascii="Georgia" w:cs="Georgia" w:eastAsia="Georgia" w:hAnsi="Georgia"/>
-                <w:b/>
-                <w:bCs/>
-                <w:color w:val="1C1714"/>
-                <w:sz w:val="21"/>
-                <w:szCs w:val="21"/>
-              </w:rPr>
-              <w:t xml:space="preserve">Ahora sí, lo que hace que no tenga comparación: sus más de 500 metros de zonas comunes.</w:t>
-            </w:r>
-          </w:p>
-        </w:tc>
-        <w:tc>
-          <w:tcPr>
-            <w:tcW w:type="dxa" w:w="3200"/>
-            <w:tcBorders>
-              <w:top w:val="none" w:color="FFFFFF" w:sz="0"/>
-              <w:left w:val="none" w:color="FFFFFF" w:sz="0"/>
-              <w:bottom w:val="single" w:color="D8CDB6" w:sz="4"/>
-              <w:right w:val="none" w:color="FFFFFF" w:sz="0"/>
-            </w:tcBorders>
-            <w:tcMar>
-              <w:top w:type="dxa" w:w="90"/>
-              <w:left w:type="dxa" w:w="100"/>
-              <w:bottom w:type="dxa" w:w="90"/>
-              <w:right w:type="dxa" w:w="100"/>
-            </w:tcMar>
-          </w:tcPr>
-          <w:p>
-            <w:pPr>
-              <w:spacing w:after="0" w:line="276"/>
-            </w:pPr>
-            <w:r>
-              <w:rPr>
-                <w:rFonts w:ascii="Calibri" w:cs="Calibri" w:eastAsia="Calibri" w:hAnsi="Calibri"/>
-                <w:color w:val="5A4E42"/>
-                <w:sz w:val="18"/>
-                <w:szCs w:val="18"/>
-              </w:rPr>
-              <w:t xml:space="preserve">Ascensor que se abre en las zonas comunes</w:t>
-            </w:r>
-          </w:p>
-        </w:tc>
-      </w:tr>
-      <w:tr>
-        <w:trPr>
-          <w:cantSplit/>
-        </w:trPr>
-        <w:tc>
-          <w:tcPr>
-            <w:tcW w:type="dxa" w:w="1000"/>
-            <w:tcBorders>
-              <w:top w:val="none" w:color="FFFFFF" w:sz="0"/>
-              <w:left w:val="none" w:color="FFFFFF" w:sz="0"/>
-              <w:bottom w:val="single" w:color="D8CDB6" w:sz="4"/>
-              <w:right w:val="none" w:color="FFFFFF" w:sz="0"/>
-            </w:tcBorders>
-            <w:tcMar>
-              <w:top w:type="dxa" w:w="90"/>
-              <w:left w:type="dxa" w:w="100"/>
-              <w:bottom w:type="dxa" w:w="90"/>
-              <w:right w:type="dxa" w:w="100"/>
-            </w:tcMar>
-          </w:tcPr>
-          <w:p>
-            <w:pPr>
-              <w:spacing w:after="0" w:line="276"/>
-            </w:pPr>
-            <w:r>
-              <w:rPr>
-                <w:rFonts w:ascii="Calibri" w:cs="Calibri" w:eastAsia="Calibri" w:hAnsi="Calibri"/>
-                <w:b/>
-                <w:bCs/>
-                <w:color w:val="1C1714"/>
-                <w:sz w:val="17"/>
-                <w:szCs w:val="17"/>
-              </w:rPr>
-              <w:t xml:space="preserve">50–62 s</w:t>
-            </w:r>
-          </w:p>
-        </w:tc>
-        <w:tc>
-          <w:tcPr>
-            <w:tcW w:type="dxa" w:w="5160"/>
-            <w:tcBorders>
-              <w:top w:val="none" w:color="FFFFFF" w:sz="0"/>
-              <w:left w:val="none" w:color="FFFFFF" w:sz="0"/>
-              <w:bottom w:val="single" w:color="D8CDB6" w:sz="4"/>
-              <w:right w:val="none" w:color="FFFFFF" w:sz="0"/>
-            </w:tcBorders>
-            <w:tcMar>
-              <w:top w:type="dxa" w:w="90"/>
-              <w:left w:type="dxa" w:w="100"/>
-              <w:bottom w:type="dxa" w:w="90"/>
-              <w:right w:type="dxa" w:w="100"/>
-            </w:tcMar>
-          </w:tcPr>
-          <w:p>
-            <w:pPr>
-              <w:spacing w:after="0" w:line="276"/>
-            </w:pPr>
-            <w:r>
-              <w:rPr>
-                <w:rFonts w:ascii="Georgia" w:cs="Georgia" w:eastAsia="Georgia" w:hAnsi="Georgia"/>
-                <w:color w:val="1C1714"/>
-                <w:sz w:val="21"/>
-                <w:szCs w:val="21"/>
-              </w:rPr>
-              <w:t xml:space="preserve">Un coworking para trabajar cómodamente, un teatrino para maratonear la serie que quieras, una sala de juntas para tus reuniones, un gimnasio completamente dotado y dos terrazas: una para adultos y otra para niños y jóvenes.</w:t>
-            </w:r>
-          </w:p>
-        </w:tc>
-        <w:tc>
-          <w:tcPr>
-            <w:tcW w:type="dxa" w:w="3200"/>
-            <w:tcBorders>
-              <w:top w:val="none" w:color="FFFFFF" w:sz="0"/>
-              <w:left w:val="none" w:color="FFFFFF" w:sz="0"/>
-              <w:bottom w:val="single" w:color="D8CDB6" w:sz="4"/>
-              <w:right w:val="none" w:color="FFFFFF" w:sz="0"/>
-            </w:tcBorders>
-            <w:tcMar>
-              <w:top w:type="dxa" w:w="90"/>
-              <w:left w:type="dxa" w:w="100"/>
-              <w:bottom w:type="dxa" w:w="90"/>
-              <w:right w:type="dxa" w:w="100"/>
-            </w:tcMar>
-          </w:tcPr>
-          <w:p>
-            <w:pPr>
-              <w:spacing w:after="0" w:line="276"/>
-            </w:pPr>
-            <w:r>
-              <w:rPr>
-                <w:rFonts w:ascii="Calibri" w:cs="Calibri" w:eastAsia="Calibri" w:hAnsi="Calibri"/>
-                <w:color w:val="5A4E42"/>
-                <w:sz w:val="18"/>
-                <w:szCs w:val="18"/>
-              </w:rPr>
-              <w:t xml:space="preserve">Un plano de 2 s por zona común</w:t>
-            </w:r>
-          </w:p>
-        </w:tc>
-      </w:tr>
-      <w:tr>
-        <w:trPr>
-          <w:cantSplit/>
-        </w:trPr>
-        <w:tc>
-          <w:tcPr>
-            <w:tcW w:type="dxa" w:w="1000"/>
-            <w:tcBorders>
-              <w:top w:val="none" w:color="FFFFFF" w:sz="0"/>
-              <w:left w:val="none" w:color="FFFFFF" w:sz="0"/>
-              <w:bottom w:val="single" w:color="D8CDB6" w:sz="4"/>
-              <w:right w:val="none" w:color="FFFFFF" w:sz="0"/>
-            </w:tcBorders>
-            <w:tcMar>
-              <w:top w:type="dxa" w:w="90"/>
-              <w:left w:type="dxa" w:w="100"/>
-              <w:bottom w:type="dxa" w:w="90"/>
-              <w:right w:type="dxa" w:w="100"/>
-            </w:tcMar>
-          </w:tcPr>
-          <w:p>
-            <w:pPr>
-              <w:spacing w:after="0" w:line="276"/>
-            </w:pPr>
-            <w:r>
-              <w:rPr>
-                <w:rFonts w:ascii="Calibri" w:cs="Calibri" w:eastAsia="Calibri" w:hAnsi="Calibri"/>
-                <w:b/>
-                <w:bCs/>
-                <w:color w:val="1C1714"/>
-                <w:sz w:val="17"/>
-                <w:szCs w:val="17"/>
-              </w:rPr>
-              <w:t xml:space="preserve">62–68 s</w:t>
-            </w:r>
-          </w:p>
-        </w:tc>
-        <w:tc>
-          <w:tcPr>
-            <w:tcW w:type="dxa" w:w="5160"/>
-            <w:tcBorders>
-              <w:top w:val="none" w:color="FFFFFF" w:sz="0"/>
-              <w:left w:val="none" w:color="FFFFFF" w:sz="0"/>
-              <w:bottom w:val="single" w:color="D8CDB6" w:sz="4"/>
-              <w:right w:val="none" w:color="FFFFFF" w:sz="0"/>
-            </w:tcBorders>
-            <w:tcMar>
-              <w:top w:type="dxa" w:w="90"/>
-              <w:left w:type="dxa" w:w="100"/>
-              <w:bottom w:type="dxa" w:w="90"/>
-              <w:right w:type="dxa" w:w="100"/>
-            </w:tcMar>
-          </w:tcPr>
-          <w:p>
-            <w:pPr>
-              <w:spacing w:after="0" w:line="276"/>
-            </w:pPr>
-            <w:r>
-              <w:rPr>
-                <w:rFonts w:ascii="Georgia" w:cs="Georgia" w:eastAsia="Georgia" w:hAnsi="Georgia"/>
-                <w:b/>
-                <w:bCs/>
-                <w:color w:val="1C1714"/>
-                <w:sz w:val="21"/>
-                <w:szCs w:val="21"/>
-              </w:rPr>
-              <w:t xml:space="preserve">¿Y el precio?</w:t>
-            </w:r>
-            <w:r>
-              <w:rPr>
-                <w:rFonts w:ascii="Georgia" w:cs="Georgia" w:eastAsia="Georgia" w:hAnsi="Georgia"/>
-                <w:color w:val="1C1714"/>
-                <w:sz w:val="21"/>
-                <w:szCs w:val="21"/>
-              </w:rPr>
-              <w:t xml:space="preserve"> Esta es la única unidad que nos queda disponible, y puedes comprarla por 1.520 millones.</w:t>
-            </w:r>
-          </w:p>
-        </w:tc>
-        <w:tc>
-          <w:tcPr>
-            <w:tcW w:type="dxa" w:w="3200"/>
-            <w:tcBorders>
-              <w:top w:val="none" w:color="FFFFFF" w:sz="0"/>
-              <w:left w:val="none" w:color="FFFFFF" w:sz="0"/>
-              <w:bottom w:val="single" w:color="D8CDB6" w:sz="4"/>
-              <w:right w:val="none" w:color="FFFFFF" w:sz="0"/>
-            </w:tcBorders>
-            <w:tcMar>
-              <w:top w:type="dxa" w:w="90"/>
-              <w:left w:type="dxa" w:w="100"/>
-              <w:bottom w:type="dxa" w:w="90"/>
-              <w:right w:type="dxa" w:w="100"/>
-            </w:tcMar>
-          </w:tcPr>
-          <w:p>
-            <w:pPr>
-              <w:spacing w:after="0" w:line="276"/>
-            </w:pPr>
-            <w:r>
-              <w:rPr>
-                <w:rFonts w:ascii="Calibri" w:cs="Calibri" w:eastAsia="Calibri" w:hAnsi="Calibri"/>
-                <w:color w:val="5A4E42"/>
-                <w:sz w:val="18"/>
-                <w:szCs w:val="18"/>
-              </w:rPr>
-              <w:t xml:space="preserve">Agente a cámara en la terraza. Texto: </w:t>
-            </w:r>
-            <w:r>
-              <w:rPr>
-                <w:rFonts w:ascii="Calibri" w:cs="Calibri" w:eastAsia="Calibri" w:hAnsi="Calibri"/>
-                <w:b/>
-                <w:bCs/>
-                <w:color w:val="5A4E42"/>
-                <w:sz w:val="18"/>
-                <w:szCs w:val="18"/>
-              </w:rPr>
-              <w:t xml:space="preserve">$1.520M · Última unidad</w:t>
-            </w:r>
-          </w:p>
-        </w:tc>
-      </w:tr>
-      <w:tr>
-        <w:trPr>
-          <w:cantSplit/>
-        </w:trPr>
-        <w:tc>
-          <w:tcPr>
-            <w:tcW w:type="dxa" w:w="1000"/>
-            <w:tcBorders>
-              <w:top w:val="none" w:color="FFFFFF" w:sz="0"/>
-              <w:left w:val="none" w:color="FFFFFF" w:sz="0"/>
-              <w:bottom w:val="single" w:color="D8CDB6" w:sz="4"/>
-              <w:right w:val="none" w:color="FFFFFF" w:sz="0"/>
-            </w:tcBorders>
-            <w:tcMar>
-              <w:top w:type="dxa" w:w="90"/>
-              <w:left w:type="dxa" w:w="100"/>
-              <w:bottom w:type="dxa" w:w="90"/>
-              <w:right w:type="dxa" w:w="100"/>
-            </w:tcMar>
-          </w:tcPr>
-          <w:p>
-            <w:pPr>
-              <w:spacing w:after="0" w:line="276"/>
-            </w:pPr>
-            <w:r>
-              <w:rPr>
-                <w:rFonts w:ascii="Calibri" w:cs="Calibri" w:eastAsia="Calibri" w:hAnsi="Calibri"/>
-                <w:b/>
-                <w:bCs/>
-                <w:color w:val="1C1714"/>
-                <w:sz w:val="17"/>
-                <w:szCs w:val="17"/>
-              </w:rPr>
-              <w:t xml:space="preserve">68–75 s</w:t>
-            </w:r>
-          </w:p>
-        </w:tc>
-        <w:tc>
-          <w:tcPr>
-            <w:tcW w:type="dxa" w:w="5160"/>
-            <w:tcBorders>
-              <w:top w:val="none" w:color="FFFFFF" w:sz="0"/>
-              <w:left w:val="none" w:color="FFFFFF" w:sz="0"/>
-              <w:bottom w:val="single" w:color="D8CDB6" w:sz="4"/>
-              <w:right w:val="none" w:color="FFFFFF" w:sz="0"/>
-            </w:tcBorders>
-            <w:tcMar>
-              <w:top w:type="dxa" w:w="90"/>
-              <w:left w:type="dxa" w:w="100"/>
-              <w:bottom w:type="dxa" w:w="90"/>
-              <w:right w:type="dxa" w:w="100"/>
-            </w:tcMar>
-          </w:tcPr>
-          <w:p>
-            <w:pPr>
-              <w:spacing w:after="0" w:line="276"/>
-            </w:pPr>
-            <w:r>
-              <w:rPr>
-                <w:rFonts w:ascii="Georgia" w:cs="Georgia" w:eastAsia="Georgia" w:hAnsi="Georgia"/>
-                <w:b/>
-                <w:bCs/>
-                <w:color w:val="1C1714"/>
-                <w:sz w:val="21"/>
-                <w:szCs w:val="21"/>
-              </w:rPr>
-              <w:t xml:space="preserve">Aún quedan espacios por mostrarte.</w:t>
-            </w:r>
-            <w:r>
-              <w:rPr>
-                <w:rFonts w:ascii="Georgia" w:cs="Georgia" w:eastAsia="Georgia" w:hAnsi="Georgia"/>
-                <w:color w:val="1C1714"/>
-                <w:sz w:val="21"/>
-                <w:szCs w:val="21"/>
-              </w:rPr>
-              <w:t xml:space="preserve"> Si quieres verlos todos, comenta DOMUS y te enviamos el recorrido completo para agendar tu visita.</w:t>
-            </w:r>
-          </w:p>
-        </w:tc>
-        <w:tc>
-          <w:tcPr>
-            <w:tcW w:type="dxa" w:w="3200"/>
-            <w:tcBorders>
-              <w:top w:val="none" w:color="FFFFFF" w:sz="0"/>
-              <w:left w:val="none" w:color="FFFFFF" w:sz="0"/>
-              <w:bottom w:val="single" w:color="D8CDB6" w:sz="4"/>
-              <w:right w:val="none" w:color="FFFFFF" w:sz="0"/>
-            </w:tcBorders>
-            <w:tcMar>
-              <w:top w:type="dxa" w:w="90"/>
-              <w:left w:type="dxa" w:w="100"/>
-              <w:bottom w:type="dxa" w:w="90"/>
-              <w:right w:type="dxa" w:w="100"/>
-            </w:tcMar>
-          </w:tcPr>
-          <w:p>
-            <w:pPr>
-              <w:spacing w:after="0" w:line="276"/>
-            </w:pPr>
-            <w:r>
-              <w:rPr>
-                <w:rFonts w:ascii="Calibri" w:cs="Calibri" w:eastAsia="Calibri" w:hAnsi="Calibri"/>
-                <w:color w:val="5A4E42"/>
-                <w:sz w:val="18"/>
-                <w:szCs w:val="18"/>
-              </w:rPr>
-              <w:t xml:space="preserve">El agente camina hacia una puerta cerrada y sale de cuadro. Texto: </w:t>
+              <w:t xml:space="preserve">Camina hacia una puerta cerrada. Texto: </w:t>
             </w:r>
             <w:r>
               <w:rPr>
@@ -3823,7 +3337,7 @@
                 <w:sz w:val="19"/>
                 <w:szCs w:val="19"/>
               </w:rPr>
-              <w:t xml:space="preserve">6 loops: la entrada, la sorpresa de la principal, "eso no es todo", las zonas, el precio y los espacios que faltan</w:t>
+              <w:t xml:space="preserve">5 loops: la entrada, la sorpresa de la principal, "eso no es todo", el precio y los espacios que faltan</w:t>
             </w:r>
           </w:p>
         </w:tc>
@@ -3923,7 +3437,7 @@
                 <w:sz w:val="19"/>
                 <w:szCs w:val="19"/>
               </w:rPr>
-              <w:t xml:space="preserve">A todos hasta el segundo 62; el precio filtra al final</w:t>
+              <w:t xml:space="preserve">A todos hasta el segundo 34; el precio filtra al final</w:t>
             </w:r>
           </w:p>
         </w:tc>
@@ -4123,7 +3637,7 @@
                 <w:sz w:val="19"/>
                 <w:szCs w:val="19"/>
               </w:rPr>
-              <w:t xml:space="preserve">Se agregaron 5 loops; se corrigió "porque" por "por qué" y "Este es la única" por "Esta es la única"</w:t>
+              <w:t xml:space="preserve">Se condensó a 50 s y se agregaron loops; se corrigió "porque" por "por qué" y "Este es la única" por "Esta es la única"</w:t>
             </w:r>
           </w:p>
         </w:tc>

</xml_diff>